<commit_message>
feat: implement boot message, cursor navigation, and select/copy/paste with full report
</commit_message>
<xml_diff>
--- a/report.docx
+++ b/report.docx
@@ -62,18 +62,8 @@
           <w:sz w:val="28"/>
           <w:szCs w:val="28"/>
         </w:rPr>
-        <w:t xml:space="preserve">Group </w:t>
-      </w:r>
-      <w:proofErr w:type="gramStart"/>
-      <w:r>
-        <w:rPr>
-          <w:rFonts w:ascii="Segoe UI Semibold" w:hAnsi="Segoe UI Semibold" w:cs="Segoe UI Semibold"/>
-          <w:sz w:val="28"/>
-          <w:szCs w:val="28"/>
-        </w:rPr>
-        <w:t>Members :</w:t>
-      </w:r>
-      <w:proofErr w:type="gramEnd"/>
+        <w:t>Group Members :</w:t>
+      </w:r>
       <w:r>
         <w:t xml:space="preserve">  </w:t>
       </w:r>
@@ -110,6 +100,24 @@
           <w:szCs w:val="24"/>
         </w:rPr>
         <w:t xml:space="preserve"> 810103437</w:t>
+      </w:r>
+    </w:p>
+    <w:p>
+      <w:pPr>
+        <w:jc w:val="center"/>
+        <w:rPr>
+          <w:rFonts w:ascii="Segoe UI Semilight" w:hAnsi="Segoe UI Semilight" w:cs="Segoe UI Semilight"/>
+          <w:sz w:val="24"/>
+          <w:szCs w:val="24"/>
+        </w:rPr>
+      </w:pPr>
+      <w:r>
+        <w:rPr>
+          <w:rFonts w:ascii="Segoe UI Semilight" w:hAnsi="Segoe UI Semilight" w:cs="Segoe UI Semilight"/>
+          <w:sz w:val="24"/>
+          <w:szCs w:val="24"/>
+        </w:rPr>
+        <w:t>Mahdiyar Hemmati - 810103549</w:t>
       </w:r>
     </w:p>
     <w:p>
@@ -1043,7 +1051,6 @@
           <w:szCs w:val="24"/>
           <w:lang w:bidi="fa-IR"/>
         </w:rPr>
-        <w:lastRenderedPageBreak/>
         <w:t> </w:t>
       </w:r>
       <w:r>
@@ -1182,7 +1189,17 @@
           <w:szCs w:val="24"/>
           <w:rtl/>
         </w:rPr>
-        <w:t>را دارد و می‌تواند به صورت شفاف پردازنده را بین چندین پردازه که در حال اجرا یا انتظار هستند، جابه‌جا کند. هر پردازه تصور می‌کند که مالک اختصاصی</w:t>
+        <w:t xml:space="preserve">را دارد و می‌تواند به صورت شفاف پردازنده را بین چندین پردازه که در حال اجرا یا انتظار هستند، </w:t>
+      </w:r>
+      <w:r>
+        <w:rPr>
+          <w:rFonts w:ascii="Segoe UI Semilight" w:hAnsi="Segoe UI Semilight" w:cs="B Nazanin"/>
+          <w:sz w:val="24"/>
+          <w:szCs w:val="24"/>
+          <w:rtl/>
+        </w:rPr>
+        <w:lastRenderedPageBreak/>
+        <w:t>جابه‌جا کند. هر پردازه تصور می‌کند که مالک اختصاصی</w:t>
       </w:r>
       <w:r>
         <w:rPr>
@@ -1858,7 +1875,6 @@
         </w:rPr>
         <w:t xml:space="preserve"> مانند شناسه پردازه (</w:t>
       </w:r>
-      <w:proofErr w:type="spellStart"/>
       <w:r>
         <w:rPr>
           <w:rFonts w:ascii="Segoe UI Semilight" w:hAnsi="Segoe UI Semilight" w:cs="B Nazanin"/>
@@ -1868,7 +1884,6 @@
         </w:rPr>
         <w:t>pid</w:t>
       </w:r>
-      <w:proofErr w:type="spellEnd"/>
       <w:r>
         <w:rPr>
           <w:rFonts w:ascii="Segoe UI Semilight" w:hAnsi="Segoe UI Semilight" w:cs="B Nazanin"/>
@@ -1928,7 +1943,6 @@
         </w:rPr>
         <w:t>)، اشاره‌گر به پشته هسته (</w:t>
       </w:r>
-      <w:proofErr w:type="spellStart"/>
       <w:r>
         <w:rPr>
           <w:rFonts w:ascii="Segoe UI Semilight" w:hAnsi="Segoe UI Semilight" w:cs="B Nazanin"/>
@@ -1938,7 +1952,6 @@
         </w:rPr>
         <w:t>kstack</w:t>
       </w:r>
-      <w:proofErr w:type="spellEnd"/>
       <w:r>
         <w:rPr>
           <w:rFonts w:ascii="Segoe UI Semilight" w:hAnsi="Segoe UI Semilight" w:cs="B Nazanin"/>
@@ -2058,7 +2071,6 @@
         </w:rPr>
         <w:t xml:space="preserve"> و </w:t>
       </w:r>
-      <w:proofErr w:type="spellStart"/>
       <w:r>
         <w:rPr>
           <w:rFonts w:ascii="Segoe UI Semilight" w:hAnsi="Segoe UI Semilight" w:cs="B Nazanin"/>
@@ -2068,7 +2080,6 @@
         </w:rPr>
         <w:t>trapframe</w:t>
       </w:r>
-      <w:proofErr w:type="spellEnd"/>
       <w:r>
         <w:rPr>
           <w:rFonts w:ascii="Segoe UI Semilight" w:hAnsi="Segoe UI Semilight" w:cs="B Nazanin"/>
@@ -4313,18 +4324,7 @@
           <w:rtl/>
           <w:lang w:bidi="fa-IR"/>
         </w:rPr>
-        <w:t xml:space="preserve">). </w:t>
-      </w:r>
-      <w:r>
-        <w:rPr>
-          <w:rFonts w:ascii="Segoe UI Semilight" w:hAnsi="Segoe UI Semilight" w:cs="B Nazanin"/>
-          <w:sz w:val="24"/>
-          <w:szCs w:val="24"/>
-          <w:rtl/>
-          <w:lang w:bidi="fa-IR"/>
-        </w:rPr>
-        <w:lastRenderedPageBreak/>
-        <w:t>ا</w:t>
+        <w:t>). ا</w:t>
       </w:r>
       <w:r>
         <w:rPr>
@@ -5425,6 +5425,7 @@
           <w:rtl/>
           <w:lang w:bidi="fa-IR"/>
         </w:rPr>
+        <w:lastRenderedPageBreak/>
         <w:t>مز</w:t>
       </w:r>
       <w:r>
@@ -6517,7 +6518,7 @@
         <w:bidi/>
         <w:ind w:left="540"/>
         <w:rPr>
-          <w:rFonts w:ascii="Segoe UI Semilight" w:hAnsi="Segoe UI Semilight" w:cs="B Nazanin" w:hint="cs"/>
+          <w:rFonts w:ascii="Segoe UI Semilight" w:hAnsi="Segoe UI Semilight" w:cs="B Nazanin"/>
           <w:sz w:val="24"/>
           <w:szCs w:val="24"/>
           <w:rtl/>
@@ -6531,7 +6532,7 @@
         <w:bidi/>
         <w:ind w:left="540"/>
         <w:rPr>
-          <w:rFonts w:ascii="Segoe UI Semilight" w:hAnsi="Segoe UI Semilight" w:cs="B Nazanin" w:hint="cs"/>
+          <w:rFonts w:ascii="Segoe UI Semilight" w:hAnsi="Segoe UI Semilight" w:cs="B Nazanin"/>
           <w:sz w:val="24"/>
           <w:szCs w:val="24"/>
           <w:rtl/>
@@ -6556,7 +6557,7 @@
         <w:bidi/>
         <w:ind w:left="540"/>
         <w:rPr>
-          <w:rFonts w:ascii="Segoe UI Semilight" w:hAnsi="Segoe UI Semilight" w:cs="B Nazanin" w:hint="cs"/>
+          <w:rFonts w:ascii="Segoe UI Semilight" w:hAnsi="Segoe UI Semilight" w:cs="B Nazanin"/>
           <w:sz w:val="24"/>
           <w:szCs w:val="24"/>
           <w:rtl/>
@@ -8580,6 +8581,7 @@
   <w:style w:type="character" w:default="1" w:styleId="DefaultParagraphFont">
     <w:name w:val="Default Paragraph Font"/>
     <w:uiPriority w:val="1"/>
+    <w:semiHidden/>
     <w:unhideWhenUsed/>
   </w:style>
   <w:style w:type="table" w:default="1" w:styleId="TableNormal">
@@ -9102,7 +9104,7 @@
           <w:r>
             <w:rPr>
               <w:rFonts w:asciiTheme="majorHAnsi" w:eastAsiaTheme="majorEastAsia" w:hAnsiTheme="majorHAnsi" w:cstheme="majorBidi"/>
-              <w:color w:val="2F5496" w:themeColor="accent1" w:themeShade="BF"/>
+              <w:color w:val="0F4761" w:themeColor="accent1" w:themeShade="BF"/>
               <w:sz w:val="32"/>
               <w:szCs w:val="32"/>
             </w:rPr>
@@ -9150,7 +9152,7 @@
     <w:charset w:val="00"/>
     <w:family w:val="swiss"/>
     <w:pitch w:val="variable"/>
-    <w:sig w:usb0="E4002EFF" w:usb1="C000247B" w:usb2="00000009" w:usb3="00000000" w:csb0="000001FF" w:csb1="00000000"/>
+    <w:sig w:usb0="E4002EFF" w:usb1="C200247B" w:usb2="00000009" w:usb3="00000000" w:csb0="000001FF" w:csb1="00000000"/>
   </w:font>
   <w:font w:name="Arial">
     <w:panose1 w:val="020B0604020202020204"/>
@@ -9164,7 +9166,7 @@
     <w:charset w:val="00"/>
     <w:family w:val="swiss"/>
     <w:pitch w:val="variable"/>
-    <w:sig w:usb0="E4002EFF" w:usb1="C000247B" w:usb2="00000009" w:usb3="00000000" w:csb0="000001FF" w:csb1="00000000"/>
+    <w:sig w:usb0="E4002EFF" w:usb1="C200247B" w:usb2="00000009" w:usb3="00000000" w:csb0="000001FF" w:csb1="00000000"/>
   </w:font>
   <w:font w:name="Segoe UI Semibold">
     <w:panose1 w:val="020B0702040204020203"/>
@@ -9181,7 +9183,7 @@
     <w:sig w:usb0="E4002EFF" w:usb1="C000E47F" w:usb2="00000009" w:usb3="00000000" w:csb0="000001FF" w:csb1="00000000"/>
   </w:font>
   <w:font w:name="B Nazanin">
-    <w:panose1 w:val="00000400000000000000"/>
+    <w:altName w:val="Arial"/>
     <w:charset w:val="B2"/>
     <w:family w:val="auto"/>
     <w:pitch w:val="variable"/>
@@ -9193,6 +9195,18 @@
     <w:family w:val="swiss"/>
     <w:pitch w:val="variable"/>
     <w:sig w:usb0="00000003" w:usb1="00000000" w:usb2="00000000" w:usb3="00000000" w:csb0="00000001" w:csb1="00000000"/>
+  </w:font>
+  <w:font w:name="Aptos">
+    <w:charset w:val="00"/>
+    <w:family w:val="swiss"/>
+    <w:pitch w:val="variable"/>
+    <w:sig w:usb0="20000287" w:usb1="00000003" w:usb2="00000000" w:usb3="00000000" w:csb0="0000019F" w:csb1="00000000"/>
+  </w:font>
+  <w:font w:name="Aptos Display">
+    <w:charset w:val="00"/>
+    <w:family w:val="swiss"/>
+    <w:pitch w:val="variable"/>
+    <w:sig w:usb0="20000287" w:usb1="00000003" w:usb2="00000000" w:usb3="00000000" w:csb0="0000019F" w:csb1="00000000"/>
   </w:font>
 </w:fonts>
 </file>
@@ -9213,8 +9227,10 @@
   </w:compat>
   <w:rsids>
     <w:rsidRoot w:val="00855FAE"/>
+    <w:rsid w:val="00267550"/>
     <w:rsid w:val="005E6C31"/>
     <w:rsid w:val="00855FAE"/>
+    <w:rsid w:val="00AA5EA7"/>
     <w:rsid w:val="00BC69BB"/>
     <w:rsid w:val="00D70BD2"/>
     <w:rsid w:val="00DE559B"/>

</xml_diff>